<commit_message>
docs(promotion-pager): plain-language pass, Plausible explainer, Comms owns UTM tagging (v1.5.63)
</commit_message>
<xml_diff>
--- a/docs/PAGE-PROMOTION-STRATEGY.docx
+++ b/docs/PAGE-PROMOTION-STRATEGY.docx
@@ -83,7 +83,25 @@
     </w:p>
     <w:p>
       <w:pPr>
-        <w:pStyle w:val="BodyText"/>
+        <w:pStyle w:val="BlockText"/>
+      </w:pPr>
+      <w:r>
+        <w:rPr>
+          <w:b/>
+          <w:bCs/>
+        </w:rPr>
+        <w:t xml:space="preserve">About the numbers:</w:t>
+      </w:r>
+      <w:r>
+        <w:t xml:space="preserve"> </w:t>
+      </w:r>
+      <w:r>
+        <w:t xml:space="preserve">every figure in this briefing comes from Plausible, the website’s analytics tool — a privacy-friendly counterpart to Google Analytics that we run on our own server. It counts visits and shows where each one came from, without cookies and without tracking individual people. These are our own measured numbers, not estimates.</w:t>
+      </w:r>
+    </w:p>
+    <w:p>
+      <w:pPr>
+        <w:pStyle w:val="FirstParagraph"/>
       </w:pPr>
       <w:r>
         <w:rPr>
@@ -100,7 +118,7 @@
           <w:i/>
           <w:iCs/>
         </w:rPr>
-        <w:t xml:space="preserve">(ICJIA’s own Plausible analytics, trailing 12 months)</w:t>
+        <w:t xml:space="preserve">(last 12 months)</w:t>
       </w:r>
     </w:p>
     <w:tbl>
@@ -275,7 +293,7 @@
               <w:t xml:space="preserve"> </w:t>
             </w:r>
             <w:r>
-              <w:t xml:space="preserve">to social — a floor, not the truth: untagged app &amp; email clicks are filed under</w:t>
+              <w:t xml:space="preserve">to social — a floor, not the truth: clicks from apps and email often arrive unlabeled and get filed under</w:t>
             </w:r>
             <w:r>
               <w:t xml:space="preserve"> </w:t>
@@ -301,23 +319,23 @@
         <w:pStyle w:val="FirstParagraph"/>
       </w:pPr>
       <w:r>
-        <w:t xml:space="preserve">Over the last 12 months the site drew</w:t>
-      </w:r>
-      <w:r>
-        <w:t xml:space="preserve"> </w:t>
-      </w:r>
-      <w:r>
-        <w:rPr>
-          <w:b/>
-          <w:bCs/>
-        </w:rPr>
-        <w:t xml:space="preserve">61,100 visitors</w:t>
-      </w:r>
-      <w:r>
-        <w:t xml:space="preserve"> </w:t>
-      </w:r>
-      <w:r>
-        <w:t xml:space="preserve">across</w:t>
+        <w:t xml:space="preserve">Over the last 12 months,</w:t>
+      </w:r>
+      <w:r>
+        <w:t xml:space="preserve"> </w:t>
+      </w:r>
+      <w:r>
+        <w:rPr>
+          <w:b/>
+          <w:bCs/>
+        </w:rPr>
+        <w:t xml:space="preserve">61,100 different people</w:t>
+      </w:r>
+      <w:r>
+        <w:t xml:space="preserve"> </w:t>
+      </w:r>
+      <w:r>
+        <w:t xml:space="preserve">made</w:t>
       </w:r>
       <w:r>
         <w:t xml:space="preserve"> </w:t>
@@ -333,17 +351,17 @@
         <w:t xml:space="preserve"> </w:t>
       </w:r>
       <w:r>
-        <w:t xml:space="preserve">and</w:t>
-      </w:r>
-      <w:r>
-        <w:t xml:space="preserve"> </w:t>
-      </w:r>
-      <w:r>
-        <w:rPr>
-          <w:b/>
-          <w:bCs/>
-        </w:rPr>
-        <w:t xml:space="preserve">463,700 pageviews</w:t>
+        <w:t xml:space="preserve">to the site and viewed</w:t>
+      </w:r>
+      <w:r>
+        <w:t xml:space="preserve"> </w:t>
+      </w:r>
+      <w:r>
+        <w:rPr>
+          <w:b/>
+          <w:bCs/>
+        </w:rPr>
+        <w:t xml:space="preserve">463,700 pages</w:t>
       </w:r>
       <w:r>
         <w:t xml:space="preserve">. About</w:t>
@@ -362,7 +380,7 @@
         <w:t xml:space="preserve"> </w:t>
       </w:r>
       <w:r>
-        <w:t xml:space="preserve">of those visits arrived through a search engine or as</w:t>
+        <w:t xml:space="preserve">of those visits arrived either from a search engine or as what analytics calls</w:t>
       </w:r>
       <w:r>
         <w:t xml:space="preserve"> </w:t>
@@ -374,7 +392,7 @@
         <w:t xml:space="preserve"> </w:t>
       </w:r>
       <w:r>
-        <w:t xml:space="preserve">— the bucket where analytics also files every click whose origin it cannot see (more on that below). People land on the exact page that answers their question, read it, and leave (63% bounce rate). Only 1 visit in 5 even begins at the homepage. Almost nobody arrives at the front door and browses the menus looking for something new.</w:t>
+        <w:t xml:space="preserve">— clicks that show up with no information about where they came from (more on that below). People land on the exact page that answers their question, read it, and leave: 63% of visits are one page and done. Only 1 visit in 5 even begins at the homepage. Almost nobody arrives at the front door and browses the menus looking for something new.</w:t>
       </w:r>
     </w:p>
     <w:p>
@@ -413,13 +431,13 @@
           <w:b/>
           <w:bCs/>
         </w:rPr>
-        <w:t xml:space="preserve">AI assistants are now our #3 referrer.</w:t>
-      </w:r>
-      <w:r>
-        <w:t xml:space="preserve"> </w:t>
-      </w:r>
-      <w:r>
-        <w:t xml:space="preserve">ChatGPT sent ~2,500 visitors last year — more than Bing. Search engines and AI assistants have one thing in common: they can only recommend pages whose</w:t>
+        <w:t xml:space="preserve">AI assistants are now our #3 source of visitors.</w:t>
+      </w:r>
+      <w:r>
+        <w:t xml:space="preserve"> </w:t>
+      </w:r>
+      <w:r>
+        <w:t xml:space="preserve">ChatGPT sent ~2,500 people to the site last year — more than Bing. Search engines and AI assistants have one thing in common: they can only recommend pages whose</w:t>
       </w:r>
       <w:r>
         <w:t xml:space="preserve"> </w:t>
@@ -520,7 +538,7 @@
               <w:jc w:val="left"/>
             </w:pPr>
             <w:r>
-              <w:t xml:space="preserve">Top Research Hub article (promoted + search-indexed)</w:t>
+              <w:t xml:space="preserve">Top Research Hub article (promoted + found via Google)</w:t>
             </w:r>
           </w:p>
         </w:tc>
@@ -607,7 +625,7 @@
         <w:pStyle w:val="BodyText"/>
       </w:pPr>
       <w:r>
-        <w:t xml:space="preserve">The Homicide Reporting page has a second, structural problem: its centerpiece is an embedded Tableau dashboard. To Google — and to ChatGPT — an embedded dashboard is nearly invisible. The page carries very little indexable text, so organic search will not build this audience on its own, either. Left passive, /homicide stays at tens of visitors a month.</w:t>
+        <w:t xml:space="preserve">The Homicide Reporting page has a second, structural problem: its centerpiece — the interactive dashboard — is drawn on our page by another website (the state’s Tableau server). To Google, and to ChatGPT, that window is effectively invisible: our page contains almost no text they can read, so they have nothing to index or quote, and search will not build this audience on its own, either. Left passive, /homicide stays at tens of visitors a month.</w:t>
       </w:r>
     </w:p>
     <w:p>
@@ -764,7 +782,7 @@
         <w:t xml:space="preserve">three months of the passive baseline in 48 hours</w:t>
       </w:r>
       <w:r>
-        <w:t xml:space="preserve">, delivered to the equivalent of 70% of a typical month’s entire site audience. And if past Dispatch sends drove clicks, our analytics never saw them: untagged email lands in</w:t>
+        <w:t xml:space="preserve">, delivered to the equivalent of 70% of a typical month’s entire site audience. And if past sends drove clicks, our analytics never saw them — email clicks arrive with no origin information and get filed under</w:t>
       </w:r>
       <w:r>
         <w:t xml:space="preserve"> </w:t>
@@ -810,7 +828,7 @@
         <w:t xml:space="preserve"> </w:t>
       </w:r>
       <w:r>
-        <w:t xml:space="preserve">share is ~2% of traffic — ≈1,500 visitors last year, and it has sat in that range since tracking began in 2021 (Facebook runs a steady 50–150 visitors/month: ambient shares, no campaign spikes). Credited is a floor — social apps routinely strip the referrer — but the pattern is clear: we rarely push. The practitioner audience lives on LinkedIn; posts get re-shared by partner agencies and picked up by local press. With sustained posting, a realistic year-one outcome is social growing from ~2% to 5–10% of traffic — and its unique value is reach: it is the one channel that finds people who never search for us.</w:t>
+        <w:t xml:space="preserve">share is ~2% of traffic — ≈1,500 visitors last year, and it has sat in that range since tracking began in 2021 (Facebook runs a steady 50–150 visitors/month: ambient shares, no campaign spikes). Credited is a floor — a link tapped inside the Facebook or LinkedIn app often arrives with no origin information — but the pattern is clear: we rarely push. The practitioner audience lives on LinkedIn; posts get re-shared by partner agencies and picked up by local press. With sustained posting, a realistic year-one outcome is social growing from ~2% to 5–10% of traffic — and its unique value is reach: it is the one channel that finds people who never search for us.</w:t>
       </w:r>
     </w:p>
     <w:p>
@@ -828,7 +846,7 @@
         <w:t xml:space="preserve"> </w:t>
       </w:r>
       <w:r>
-        <w:t xml:space="preserve">A short findings piece — what the clearance data actually shows — published in the channel that already carries 48% of our pageviews, linking to the dashboard. It also creates the crawlable narrative that search engines and AI assistants can cite, which the embedded dashboard cannot provide. Hub articles compound: our top article still drew 5,900 visitors last year. Refresh the article with each quarterly data release.</w:t>
+        <w:t xml:space="preserve">A short findings piece — what the clearance data actually shows — published in the channel that already carries 48% of our pageviews, linking to the dashboard. It also gives search engines and AI assistants what the dashboard cannot: readable text to find, index, and quote. Hub articles compound: our top article still drew 5,900 visitors last year. Refresh the article with each quarterly data release.</w:t>
       </w:r>
     </w:p>
     <w:p>
@@ -926,13 +944,13 @@
           <w:b/>
           <w:bCs/>
         </w:rPr>
-        <w:t xml:space="preserve">“Direct,”</w:t>
-      </w:r>
-      <w:r>
-        <w:t xml:space="preserve"> </w:t>
-      </w:r>
-      <w:r>
-        <w:t xml:space="preserve">and 7 in 10 of them begin on deep interior URLs — article addresses nobody types by hand. Those are followed links whose origin was stripped before our analytics could see it.</w:t>
+        <w:t xml:space="preserve">“Direct”</w:t>
+      </w:r>
+      <w:r>
+        <w:t xml:space="preserve"> </w:t>
+      </w:r>
+      <w:r>
+        <w:t xml:space="preserve">— clicks that arrive with no information about where they came from. And 7 in 10 of them begin on long interior article addresses nobody types by hand: those are followed links whose origin got lost in transit.</w:t>
       </w:r>
     </w:p>
     <w:p>
@@ -954,7 +972,7 @@
         <w:t xml:space="preserve"> </w:t>
       </w:r>
       <w:r>
-        <w:t xml:space="preserve">which points at email clients, Teams, and shared documents as the biggest hidden pipe — exactly where CJ Dispatch clicks would land. The fragments that do self-identify (Teams, Word Online, Gmail, Adobe) prove each of these pipes is active.</w:t>
+        <w:t xml:space="preserve">which points at email programs, Teams chats, and shared documents as the biggest hidden pipe — exactly where CJ Dispatch clicks would land. The few that do identify themselves (Teams, Word Online, Gmail, Adobe) prove each of these pipes is active.</w:t>
       </w:r>
     </w:p>
     <w:p>
@@ -970,13 +988,25 @@
           <w:b/>
           <w:bCs/>
         </w:rPr>
-        <w:t xml:space="preserve">Social apps only partially self-report:</w:t>
-      </w:r>
-      <w:r>
-        <w:t xml:space="preserve"> </w:t>
-      </w:r>
-      <w:r>
-        <w:t xml:space="preserve">we see their link-shims (m./l./lm.facebook.com, t.co, l.instagram.com) when a referrer survives — and nothing when it doesn’t. A UTM-tagged link is immune, because the credit rides in the URL itself.</w:t>
+        <w:t xml:space="preserve">Social apps only sometimes identify themselves:</w:t>
+      </w:r>
+      <w:r>
+        <w:t xml:space="preserve"> </w:t>
+      </w:r>
+      <w:r>
+        <w:t xml:space="preserve">we can see Facebook’s mobile-app addresses when the origin information survives the trip — and nothing when it doesn’t. A link that carries its own tracking label (see</w:t>
+      </w:r>
+      <w:r>
+        <w:t xml:space="preserve"> </w:t>
+      </w:r>
+      <w:r>
+        <w:t xml:space="preserve">“UTM tags,”</w:t>
+      </w:r>
+      <w:r>
+        <w:t xml:space="preserve"> </w:t>
+      </w:r>
+      <w:r>
+        <w:t xml:space="preserve">below) is immune, because the credit travels inside the link itself.</w:t>
       </w:r>
     </w:p>
     <w:p>
@@ -1058,7 +1088,7 @@
         <w:t xml:space="preserve"> </w:t>
       </w:r>
       <w:r>
-        <w:t xml:space="preserve">Menu link, internal site search, sitemap. Do it — just don’t mistake it for promotion.</w:t>
+        <w:t xml:space="preserve">Menu link, the site’s internal search, and the page index that search engines read (the sitemap). Do it — just don’t mistake it for promotion.</w:t>
       </w:r>
     </w:p>
     <w:p>
@@ -1224,7 +1254,19 @@
         <w:t xml:space="preserve"> </w:t>
       </w:r>
       <w:r>
-        <w:t xml:space="preserve">(utm_source, utm_campaign). 98% of our visits carry no campaign tag, so email and social wins hide inside</w:t>
+        <w:t xml:space="preserve">— owned by Communications, who build the tagged links into each send and post (see</w:t>
+      </w:r>
+      <w:r>
+        <w:t xml:space="preserve"> </w:t>
+      </w:r>
+      <w:r>
+        <w:t xml:space="preserve">“UTM tags,”</w:t>
+      </w:r>
+      <w:r>
+        <w:t xml:space="preserve"> </w:t>
+      </w:r>
+      <w:r>
+        <w:t xml:space="preserve">below). 98% of our visits carry no tag today, so email and social wins hide inside</w:t>
       </w:r>
       <w:r>
         <w:t xml:space="preserve"> </w:t>
@@ -1236,7 +1278,7 @@
         <w:t xml:space="preserve"> </w:t>
       </w:r>
       <w:r>
-        <w:t xml:space="preserve">A tagged link survives app and email referrer-stripping because the credit travels in the URL itself — the few tagged links that reach us today (e.g., another agency’s govdelivery emails) attribute perfectly. Tagging turns the next launch into evidence.</w:t>
+        <w:t xml:space="preserve">A tagged link keeps its credit even when apps and email programs drop the origin information — the few tagged links that already reach us (another state agency’s email system) are counted perfectly. Tagging turns the next launch into evidence.</w:t>
       </w:r>
     </w:p>
     <w:p>
@@ -1295,7 +1337,7 @@
         <w:pStyle w:val="FirstParagraph"/>
       </w:pPr>
       <w:r>
-        <w:t xml:space="preserve">Why it matters here: a tagged link attributes correctly</w:t>
+        <w:t xml:space="preserve">Why it matters here: a tagged link is counted correctly</w:t>
       </w:r>
       <w:r>
         <w:t xml:space="preserve"> </w:t>
@@ -1311,7 +1353,19 @@
         <w:t xml:space="preserve"> </w:t>
       </w:r>
       <w:r>
-        <w:t xml:space="preserve">— even when a social app or email client strips the referrer, because the credit travels inside the URL itself. It costs nothing, requires no code changes to the site, and Constant Contact can append tags automatically to every link in a send. With tags in place, the week-two report stops being</w:t>
+        <w:t xml:space="preserve">— even when a social app or email program drops the</w:t>
+      </w:r>
+      <w:r>
+        <w:t xml:space="preserve"> </w:t>
+      </w:r>
+      <w:r>
+        <w:t xml:space="preserve">“where this click came from”</w:t>
+      </w:r>
+      <w:r>
+        <w:t xml:space="preserve"> </w:t>
+      </w:r>
+      <w:r>
+        <w:t xml:space="preserve">information — because the credit travels inside the link itself. It costs nothing, changes nothing on the website, and Constant Contact can add the tags automatically to every link in a send. With tags in place, the week-two report stops being</w:t>
       </w:r>
       <w:r>
         <w:t xml:space="preserve"> </w:t>
@@ -1343,6 +1397,24 @@
         <w:pStyle w:val="BodyText"/>
       </w:pPr>
       <w:r>
+        <w:rPr>
+          <w:b/>
+          <w:bCs/>
+        </w:rPr>
+        <w:t xml:space="preserve">Who does this: the Communications team.</w:t>
+      </w:r>
+      <w:r>
+        <w:t xml:space="preserve"> </w:t>
+      </w:r>
+      <w:r>
+        <w:t xml:space="preserve">Comms builds the tagged links into the emails and posts they send — it is part of composing the message, not a website change, and nothing about it touches the web team’s code. The web team’s role is to supply the link recipes and read the results out of Plausible.</w:t>
+      </w:r>
+    </w:p>
+    <w:p>
+      <w:pPr>
+        <w:pStyle w:val="BodyText"/>
+      </w:pPr>
+      <w:r>
         <w:t xml:space="preserve">The convention:</w:t>
       </w:r>
       <w:r>
@@ -1391,7 +1463,7 @@
         <w:t xml:space="preserve"> </w:t>
       </w:r>
       <w:r>
-        <w:t xml:space="preserve">the release (homicide-sept2026). Tags go on links we distribute</w:t>
+        <w:t xml:space="preserve">the release (homicide-sept2026). Tags belong on links distributed</w:t>
       </w:r>
       <w:r>
         <w:t xml:space="preserve"> </w:t>
@@ -1536,7 +1608,7 @@
         <w:t xml:space="preserve"> </w:t>
       </w:r>
       <w:r>
-        <w:t xml:space="preserve">ICJIA’s own analytics (Plausible, self-hosted at plausible.icjia.cloud), icjia.illinois.gov, trailing 12 months ending Aug 26, 2026, except as noted. /homicide figures: since its Aug 25 launch, unannounced.</w:t>
+        <w:t xml:space="preserve">ICJIA’s own analytics (Plausible, self-hosted at plausible.icjia.cloud), icjia.illinois.gov, last 12 months ending Aug 26, 2026, except as noted. /homicide figures: since its Aug 25 launch, unannounced.</w:t>
       </w:r>
     </w:p>
     <w:p>
@@ -1572,7 +1644,7 @@
         <w:t xml:space="preserve"> </w:t>
       </w:r>
       <w:r>
-        <w:t xml:space="preserve">credited social over the trailing 12 months = 1,520 visitors / 1,730 visits — Facebook ≈1,100 (incl. m./l./lm. app domains), LinkedIn 291, X (t.co) 87, Instagram 43 — i.e. 2.5% of visitors, 1.2% of visits. Lifetime since tracking began (~2021): Facebook 2.1% and LinkedIn 0.7% of 178,300 visitors — the credited share has never been materially higher. It is a lower bound; see</w:t>
+        <w:t xml:space="preserve">credited social over the last 12 months = 1,520 visitors / 1,730 visits — Facebook ≈1,100 (including its mobile-app addresses), LinkedIn 291, X 87, Instagram 43 — i.e. 2.5% of visitors, 1.2% of visits. Lifetime since tracking began (~2021): Facebook 2.1% and LinkedIn 0.7% of 178,300 visitors — the credited share has never been materially higher. It is a lower bound; see</w:t>
       </w:r>
       <w:r>
         <w:t xml:space="preserve"> </w:t>

</xml_diff>